<commit_message>
v1.7.2.9002: first column header label gets bumped to top row when a spanner is used
</commit_message>
<xml_diff>
--- a/development/tests/spanner/test1_basic_spanner.docx
+++ b/development/tests/spanner/test1_basic_spanner.docx
@@ -18,9 +18,146 @@
       </w:tblGrid>
       <w:tr>
         <w:trPr>
-          <w:trHeight w:val="544" w:hRule="auto"/>
+          <w:trHeight w:val="711" w:hRule="auto"/>
           <w:tblHeader/>
         </w:trPr>
+        <w:tc>
+          <w:tcPr>
+            <w:tcBorders>
+              <w:bottom w:val="none" w:sz="0" w:space="0" w:color="000000"/>
+              <w:top w:val="none" w:sz="0" w:space="0" w:color="000000"/>
+              <w:left w:val="none" w:sz="0" w:space="0" w:color="000000"/>
+              <w:right w:val="none" w:sz="0" w:space="0" w:color="000000"/>
+            </w:tcBorders>
+            <w:shd w:val="clear" w:color="auto" w:fill="CDCDCD"/>
+            <w:tcMar>
+              <w:top w:w="0" w:type="dxa"/>
+              <w:bottom w:w="0" w:type="dxa"/>
+              <w:left w:w="0" w:type="dxa"/>
+              <w:right w:w="0" w:type="dxa"/>
+            </w:tcMar>
+            <w:vAlign w:val="center"/>
+          </w:tcPr>
+          <w:p>
+            <w:pPr>
+              <w:pStyle w:val="Normal"/>
+              <w:jc w:val="left"/>
+              <w:pBdr>
+                <w:bottom w:val="none" w:sz="0" w:space="0" w:color="000000"/>
+                <w:top w:val="none" w:sz="0" w:space="0" w:color="000000"/>
+                <w:left w:val="none" w:sz="0" w:space="0" w:color="000000"/>
+                <w:right w:val="none" w:sz="0" w:space="0" w:color="000000"/>
+              </w:pBdr>
+              <w:spacing w:after="100" w:before="100" w:line="240"/>
+              <w:ind w:left="60" w:right="120" w:firstLine="0" w:firstLineChars="0"/>
+              <w:rPr>
+                <w:rFonts w:ascii="Arial" w:hAnsi="Arial" w:eastAsia="Arial" w:cs="Arial"/>
+                <w:i w:val="false"/>
+                <w:b w:val="true"/>
+                <w:u w:val="none"/>
+                <w:strike w:val="false"/>
+                <w:sz w:val="18"/>
+                <w:szCs w:val="18"/>
+                <w:color w:val="000000"/>
+              </w:rPr>
+            </w:pPr>
+            <w:r>
+              <w:rPr>
+                <w:rFonts w:ascii="Arial" w:hAnsi="Arial" w:eastAsia="Arial" w:cs="Arial"/>
+                <w:i w:val="false"/>
+                <w:b w:val="true"/>
+                <w:u w:val="none"/>
+                <w:strike w:val="false"/>
+                <w:sz w:val="18"/>
+                <w:szCs w:val="18"/>
+                <w:color w:val="000000"/>
+              </w:rPr>
+              <w:t xml:space="preserve">Category</w:t>
+            </w:r>
+            <w:r>
+              <w:rPr>
+                <w:rFonts w:ascii="Arial" w:hAnsi="Arial" w:eastAsia="Arial" w:cs="Arial"/>
+                <w:i w:val="false"/>
+                <w:b w:val="true"/>
+                <w:u w:val="none"/>
+                <w:strike w:val="false"/>
+                <w:sz w:val="18"/>
+                <w:szCs w:val="18"/>
+                <w:color w:val="000000"/>
+              </w:rPr>
+              <w:br/>
+            </w:r>
+            <w:r>
+              <w:rPr>
+                <w:rFonts w:ascii="Arial" w:hAnsi="Arial" w:eastAsia="Arial" w:cs="Arial"/>
+                <w:i w:val="false"/>
+                <w:b w:val="true"/>
+                <w:u w:val="none"/>
+                <w:strike w:val="false"/>
+                <w:sz w:val="18"/>
+                <w:szCs w:val="18"/>
+                <w:color w:val="000000"/>
+              </w:rPr>
+              <w:t xml:space="preserve">   Variable</w:t>
+            </w:r>
+          </w:p>
+        </w:tc>
+        <w:tc>
+          <w:tcPr>
+            <w:gridSpan w:val="2"/>
+            <w:tcBorders>
+              <w:bottom w:val="single" w:sz="6" w:space="0" w:color="000000"/>
+              <w:top w:val="none" w:sz="0" w:space="0" w:color="000000"/>
+              <w:left w:val="none" w:sz="0" w:space="0" w:color="000000"/>
+              <w:right w:val="none" w:sz="0" w:space="0" w:color="000000"/>
+            </w:tcBorders>
+            <w:shd w:val="clear" w:color="auto" w:fill="CDCDCD"/>
+            <w:tcMar>
+              <w:top w:w="0" w:type="dxa"/>
+              <w:bottom w:w="0" w:type="dxa"/>
+              <w:left w:w="0" w:type="dxa"/>
+              <w:right w:w="0" w:type="dxa"/>
+            </w:tcMar>
+            <w:vAlign w:val="center"/>
+          </w:tcPr>
+          <w:p>
+            <w:pPr>
+              <w:pStyle w:val="Normal"/>
+              <w:jc w:val="center"/>
+              <w:pBdr>
+                <w:bottom w:val="none" w:sz="0" w:space="0" w:color="000000"/>
+                <w:top w:val="none" w:sz="0" w:space="0" w:color="000000"/>
+                <w:left w:val="none" w:sz="0" w:space="0" w:color="000000"/>
+                <w:right w:val="none" w:sz="0" w:space="0" w:color="000000"/>
+              </w:pBdr>
+              <w:spacing w:after="100" w:before="100" w:line="240"/>
+              <w:ind w:left="60" w:right="120" w:firstLine="0" w:firstLineChars="0"/>
+              <w:rPr>
+                <w:rFonts w:ascii="Arial" w:hAnsi="Arial" w:eastAsia="Arial" w:cs="Arial"/>
+                <w:i w:val="false"/>
+                <w:b w:val="true"/>
+                <w:u w:val="none"/>
+                <w:strike w:val="false"/>
+                <w:sz w:val="18"/>
+                <w:szCs w:val="18"/>
+                <w:color w:val="000000"/>
+              </w:rPr>
+            </w:pPr>
+            <w:r>
+              <w:rPr>
+                <w:rFonts w:ascii="Arial" w:hAnsi="Arial" w:eastAsia="Arial" w:cs="Arial"/>
+                <w:i w:val="false"/>
+                <w:b w:val="true"/>
+                <w:u w:val="none"/>
+                <w:strike w:val="false"/>
+                <w:sz w:val="18"/>
+                <w:szCs w:val="18"/>
+                <w:color w:val="000000"/>
+              </w:rPr>
+              <w:t xml:space="preserve">Control</w:t>
+            </w:r>
+          </w:p>
+        </w:tc>
         <w:tc>
           <w:tcPr>
             <w:tcBorders>
@@ -128,117 +265,6 @@
                 <w:szCs w:val="18"/>
                 <w:color w:val="000000"/>
               </w:rPr>
-              <w:t xml:space="preserve">Control</w:t>
-            </w:r>
-          </w:p>
-        </w:tc>
-        <w:tc>
-          <w:tcPr>
-            <w:tcBorders>
-              <w:bottom w:val="none" w:sz="0" w:space="0" w:color="000000"/>
-              <w:top w:val="none" w:sz="0" w:space="0" w:color="000000"/>
-              <w:left w:val="none" w:sz="0" w:space="0" w:color="000000"/>
-              <w:right w:val="none" w:sz="0" w:space="0" w:color="000000"/>
-            </w:tcBorders>
-            <w:shd w:val="clear" w:color="auto" w:fill="CDCDCD"/>
-            <w:tcMar>
-              <w:top w:w="0" w:type="dxa"/>
-              <w:bottom w:w="0" w:type="dxa"/>
-              <w:left w:w="0" w:type="dxa"/>
-              <w:right w:w="0" w:type="dxa"/>
-            </w:tcMar>
-            <w:vAlign w:val="center"/>
-          </w:tcPr>
-          <w:p>
-            <w:pPr>
-              <w:pStyle w:val="Normal"/>
-              <w:jc w:val="center"/>
-              <w:pBdr>
-                <w:bottom w:val="none" w:sz="0" w:space="0" w:color="000000"/>
-                <w:top w:val="none" w:sz="0" w:space="0" w:color="000000"/>
-                <w:left w:val="none" w:sz="0" w:space="0" w:color="000000"/>
-                <w:right w:val="none" w:sz="0" w:space="0" w:color="000000"/>
-              </w:pBdr>
-              <w:spacing w:after="100" w:before="100" w:line="240"/>
-              <w:ind w:left="60" w:right="120" w:firstLine="0" w:firstLineChars="0"/>
-              <w:rPr>
-                <w:rFonts w:ascii="Arial" w:hAnsi="Arial" w:eastAsia="Arial" w:cs="Arial"/>
-                <w:i w:val="false"/>
-                <w:b w:val="true"/>
-                <w:u w:val="none"/>
-                <w:strike w:val="false"/>
-                <w:sz w:val="18"/>
-                <w:szCs w:val="18"/>
-                <w:color w:val="000000"/>
-              </w:rPr>
-            </w:pPr>
-            <w:r>
-              <w:rPr>
-                <w:rFonts w:ascii="Arial" w:hAnsi="Arial" w:eastAsia="Arial" w:cs="Arial"/>
-                <w:i w:val="false"/>
-                <w:b w:val="true"/>
-                <w:u w:val="none"/>
-                <w:strike w:val="false"/>
-                <w:sz w:val="18"/>
-                <w:szCs w:val="18"/>
-                <w:color w:val="000000"/>
-              </w:rPr>
-              <w:t xml:space="preserve"/>
-            </w:r>
-          </w:p>
-        </w:tc>
-        <w:tc>
-          <w:tcPr>
-            <w:gridSpan w:val="2"/>
-            <w:tcBorders>
-              <w:bottom w:val="single" w:sz="6" w:space="0" w:color="000000"/>
-              <w:top w:val="none" w:sz="0" w:space="0" w:color="000000"/>
-              <w:left w:val="none" w:sz="0" w:space="0" w:color="000000"/>
-              <w:right w:val="none" w:sz="0" w:space="0" w:color="000000"/>
-            </w:tcBorders>
-            <w:shd w:val="clear" w:color="auto" w:fill="CDCDCD"/>
-            <w:tcMar>
-              <w:top w:w="0" w:type="dxa"/>
-              <w:bottom w:w="0" w:type="dxa"/>
-              <w:left w:w="0" w:type="dxa"/>
-              <w:right w:w="0" w:type="dxa"/>
-            </w:tcMar>
-            <w:vAlign w:val="center"/>
-          </w:tcPr>
-          <w:p>
-            <w:pPr>
-              <w:pStyle w:val="Normal"/>
-              <w:jc w:val="center"/>
-              <w:pBdr>
-                <w:bottom w:val="none" w:sz="0" w:space="0" w:color="000000"/>
-                <w:top w:val="none" w:sz="0" w:space="0" w:color="000000"/>
-                <w:left w:val="none" w:sz="0" w:space="0" w:color="000000"/>
-                <w:right w:val="none" w:sz="0" w:space="0" w:color="000000"/>
-              </w:pBdr>
-              <w:spacing w:after="100" w:before="100" w:line="240"/>
-              <w:ind w:left="60" w:right="120" w:firstLine="0" w:firstLineChars="0"/>
-              <w:rPr>
-                <w:rFonts w:ascii="Arial" w:hAnsi="Arial" w:eastAsia="Arial" w:cs="Arial"/>
-                <w:i w:val="false"/>
-                <w:b w:val="true"/>
-                <w:u w:val="none"/>
-                <w:strike w:val="false"/>
-                <w:sz w:val="18"/>
-                <w:szCs w:val="18"/>
-                <w:color w:val="000000"/>
-              </w:rPr>
-            </w:pPr>
-            <w:r>
-              <w:rPr>
-                <w:rFonts w:ascii="Arial" w:hAnsi="Arial" w:eastAsia="Arial" w:cs="Arial"/>
-                <w:i w:val="false"/>
-                <w:b w:val="true"/>
-                <w:u w:val="none"/>
-                <w:strike w:val="false"/>
-                <w:sz w:val="18"/>
-                <w:szCs w:val="18"/>
-                <w:color w:val="000000"/>
-              </w:rPr>
               <w:t xml:space="preserve">Treatment</w:t>
             </w:r>
           </w:p>
@@ -246,7 +272,7 @@
       </w:tr>
       <w:tr>
         <w:trPr>
-          <w:trHeight w:val="711" w:hRule="auto"/>
+          <w:trHeight w:val="544" w:hRule="auto"/>
           <w:tblHeader/>
         </w:trPr>
         <w:tc>
@@ -300,33 +326,7 @@
                 <w:szCs w:val="18"/>
                 <w:color w:val="000000"/>
               </w:rPr>
-              <w:t xml:space="preserve">Category</w:t>
-            </w:r>
-            <w:r>
-              <w:rPr>
-                <w:rFonts w:ascii="Arial" w:hAnsi="Arial" w:eastAsia="Arial" w:cs="Arial"/>
-                <w:i w:val="false"/>
-                <w:b w:val="true"/>
-                <w:u w:val="none"/>
-                <w:strike w:val="false"/>
-                <w:sz w:val="18"/>
-                <w:szCs w:val="18"/>
-                <w:color w:val="000000"/>
-              </w:rPr>
-              <w:br/>
-            </w:r>
-            <w:r>
-              <w:rPr>
-                <w:rFonts w:ascii="Arial" w:hAnsi="Arial" w:eastAsia="Arial" w:cs="Arial"/>
-                <w:i w:val="false"/>
-                <w:b w:val="true"/>
-                <w:u w:val="none"/>
-                <w:strike w:val="false"/>
-                <w:sz w:val="18"/>
-                <w:szCs w:val="18"/>
-                <w:color w:val="000000"/>
-              </w:rPr>
-              <w:t xml:space="preserve">   Variable</w:t>
+              <w:t xml:space="preserve"/>
             </w:r>
           </w:p>
         </w:tc>

</xml_diff>